<commit_message>
Baseline Models Report update
feedback added
</commit_message>
<xml_diff>
--- a/final_delivery/Baseline Models Report.docx
+++ b/final_delivery/Baseline Models Report.docx
@@ -152,34 +152,34 @@
         <w:rPr>
           <w:rFonts w:ascii="Times New Roman" w:hAnsi="Times New Roman" w:cs="Times New Roman"/>
         </w:rPr>
-        <w:t xml:space="preserve">Forensic crime laboratories face constant pressure to process evidence quickly while working with limited staff and equipment. Ballistics analysis, DNA testing, and firearm examinations are extremely time-consuming, and every case that sits on the backlog delays justice for victims and investigators. In Boston, the police department responds to tens of thousands of incidents each year, yet only a small fraction actually </w:t>
-      </w:r>
-      <w:proofErr w:type="gramStart"/>
-      <w:r>
-        <w:rPr>
-          <w:rFonts w:ascii="Times New Roman" w:hAnsi="Times New Roman" w:cs="Times New Roman"/>
-        </w:rPr>
-        <w:t>involve</w:t>
-      </w:r>
-      <w:proofErr w:type="gramEnd"/>
-      <w:r>
-        <w:rPr>
-          <w:rFonts w:ascii="Times New Roman" w:hAnsi="Times New Roman" w:cs="Times New Roman"/>
-        </w:rPr>
-        <w:t xml:space="preserve"> a shooting. Still, every potential firearms-related report must be treated seriously until proven otherwise. This creates a real bottleneck: the crime lab has to decide which cases deserve immediate attention and which can safely wait.</w:t>
-      </w:r>
-    </w:p>
-    <w:p>
-      <w:pPr>
-        <w:rPr>
-          <w:rFonts w:ascii="Times New Roman" w:hAnsi="Times New Roman" w:cs="Times New Roman"/>
-        </w:rPr>
-      </w:pPr>
-      <w:r>
-        <w:rPr>
-          <w:rFonts w:ascii="Times New Roman" w:hAnsi="Times New Roman" w:cs="Times New Roman"/>
-        </w:rPr>
-        <w:t>This capstone project aims to help solve that challenge by building an AI Forensic Triage Tool. The central research question is:</w:t>
+        <w:t>Forensic crime laboratories operate under intense pressure. Every shooting incident requires extensive resources, ballistics analysis, firearm tracing, DNA testing on recovered evidence, and often multiple rounds of laboratory work. These processes are time-consuming, expensive, and critical for building strong prosecutorial cases. At the same time, the Boston Police Department responds to tens of thousands of crime incidents each year, the vast majority of which do not involve firearms.</w:t>
+      </w:r>
+    </w:p>
+    <w:p>
+      <w:pPr>
+        <w:jc w:val="both"/>
+        <w:rPr>
+          <w:rFonts w:ascii="Times New Roman" w:hAnsi="Times New Roman" w:cs="Times New Roman"/>
+        </w:rPr>
+      </w:pPr>
+      <w:r>
+        <w:rPr>
+          <w:rFonts w:ascii="Times New Roman" w:hAnsi="Times New Roman" w:cs="Times New Roman"/>
+        </w:rPr>
+        <w:t>The current workflow treats every potential firearms-related report with the same level of urgency because there is no reliable, data-driven method to triage cases at the moment an incident is logged. This uniform approach creates significant backlogs, delays justice in the most serious cases, and places unnecessary strain on already limited laboratory resources.</w:t>
+      </w:r>
+    </w:p>
+    <w:p>
+      <w:pPr>
+        <w:rPr>
+          <w:rFonts w:ascii="Times New Roman" w:hAnsi="Times New Roman" w:cs="Times New Roman"/>
+        </w:rPr>
+      </w:pPr>
+      <w:r>
+        <w:rPr>
+          <w:rFonts w:ascii="Times New Roman" w:hAnsi="Times New Roman" w:cs="Times New Roman"/>
+        </w:rPr>
+        <w:t>This capstone project addresses that operational gap by developing an AI Forensic Triage Tool. The central research question is:</w:t>
       </w:r>
       <w:r>
         <w:rPr>
@@ -207,32 +207,8 @@
         <w:rPr>
           <w:rFonts w:ascii="Times New Roman" w:hAnsi="Times New Roman" w:cs="Times New Roman"/>
         </w:rPr>
-        <w:t>We hypothesized that nighttime incidents in higher-poverty districts would show a significantly higher shooting probability — at least 35% higher than daytime or lower-poverty areas. This report covers the baseline modeling work completed so far, including the choices I made, the assumptions behind them, the results, and what I plan to do next.</w:t>
-      </w:r>
-    </w:p>
-    <w:p>
-      <w:pPr>
-        <w:jc w:val="both"/>
-        <w:rPr>
-          <w:rFonts w:ascii="Times New Roman" w:hAnsi="Times New Roman" w:cs="Times New Roman"/>
-        </w:rPr>
-      </w:pPr>
-    </w:p>
-    <w:p>
-      <w:pPr>
-        <w:jc w:val="both"/>
-        <w:rPr>
-          <w:rFonts w:ascii="Times New Roman" w:hAnsi="Times New Roman" w:cs="Times New Roman"/>
-        </w:rPr>
-      </w:pPr>
-    </w:p>
-    <w:p>
-      <w:pPr>
-        <w:jc w:val="both"/>
-        <w:rPr>
-          <w:rFonts w:ascii="Times New Roman" w:hAnsi="Times New Roman" w:cs="Times New Roman"/>
-        </w:rPr>
-      </w:pPr>
+        <w:t>I hypothesized that nighttime incidents in higher-poverty districts would show a significantly higher probability of involving a shooting, at least 35% higher than daytime or lower-poverty areas. This report presents the baseline modeling phase, including the methodological choices I made, the assumptions behind them, the results obtained, and how these results align with both the original hypothesis and the feedback received on the finalized proposal.</w:t>
+      </w:r>
     </w:p>
     <w:p>
       <w:pPr>
@@ -307,7 +283,7 @@
         <w:rPr>
           <w:rFonts w:ascii="Times New Roman" w:hAnsi="Times New Roman" w:cs="Times New Roman"/>
         </w:rPr>
-        <w:t xml:space="preserve">After finishing the preprocessing and feature engineering phase, I trained a baseline </w:t>
+        <w:t xml:space="preserve">After completing data preprocessing and feature engineering, I trained a baseline </w:t>
       </w:r>
       <w:proofErr w:type="spellStart"/>
       <w:r>
@@ -321,7 +297,7 @@
         <w:rPr>
           <w:rFonts w:ascii="Times New Roman" w:hAnsi="Times New Roman" w:cs="Times New Roman"/>
         </w:rPr>
-        <w:t xml:space="preserve"> classifier using the final prepared dataset (239,371 rows and 24 features). I chose </w:t>
+        <w:t xml:space="preserve"> classifier on the final prepared dataset containing 239,371 records and 24 engineered features. I selected </w:t>
       </w:r>
       <w:proofErr w:type="spellStart"/>
       <w:r>
@@ -335,73 +311,134 @@
         <w:rPr>
           <w:rFonts w:ascii="Times New Roman" w:hAnsi="Times New Roman" w:cs="Times New Roman"/>
         </w:rPr>
-        <w:t xml:space="preserve"> as the starting model because it performs well on tabular data, handles moderate missing values gracefully, and works naturally with SHAP values for explainability</w:t>
-      </w:r>
-      <w:r>
-        <w:rPr>
-          <w:rFonts w:ascii="Times New Roman" w:hAnsi="Times New Roman" w:cs="Times New Roman"/>
-        </w:rPr>
-        <w:t xml:space="preserve">, </w:t>
-      </w:r>
-      <w:r>
-        <w:rPr>
-          <w:rFonts w:ascii="Times New Roman" w:hAnsi="Times New Roman" w:cs="Times New Roman"/>
-        </w:rPr>
-        <w:t>something that will be essential when presenting results to the crime lab.</w:t>
-      </w:r>
-    </w:p>
-    <w:p>
-      <w:pPr>
-        <w:rPr>
-          <w:rFonts w:ascii="Times New Roman" w:hAnsi="Times New Roman" w:cs="Times New Roman"/>
-        </w:rPr>
-      </w:pPr>
-      <w:r>
-        <w:rPr>
-          <w:rFonts w:ascii="Times New Roman" w:hAnsi="Times New Roman" w:cs="Times New Roman"/>
-        </w:rPr>
-        <w:t>The modeling process included the following steps:</w:t>
+        <w:t xml:space="preserve"> as the initial algorithm because it is well-suited for tabular data, natively supports class imbalance through weighting, and integrates seamlessly with SHAP explainability, a critical requirement for building trust with forensic stakeholders who need to understand why the model flags certain incidents as high-risk.</w:t>
+      </w:r>
+    </w:p>
+    <w:p>
+      <w:pPr>
+        <w:jc w:val="both"/>
+        <w:rPr>
+          <w:rFonts w:ascii="Times New Roman" w:hAnsi="Times New Roman" w:cs="Times New Roman"/>
+        </w:rPr>
+      </w:pPr>
+      <w:r>
+        <w:rPr>
+          <w:rFonts w:ascii="Times New Roman" w:hAnsi="Times New Roman" w:cs="Times New Roman"/>
+        </w:rPr>
+        <w:t>The modeling pipeline included the following steps:</w:t>
       </w:r>
     </w:p>
     <w:p>
       <w:pPr>
         <w:numPr>
           <w:ilvl w:val="0"/>
-          <w:numId w:val="1"/>
+          <w:numId w:val="5"/>
         </w:numPr>
-        <w:rPr>
-          <w:rFonts w:ascii="Times New Roman" w:hAnsi="Times New Roman" w:cs="Times New Roman"/>
-        </w:rPr>
-      </w:pPr>
-      <w:r>
-        <w:rPr>
-          <w:rFonts w:ascii="Times New Roman" w:hAnsi="Times New Roman" w:cs="Times New Roman"/>
-        </w:rPr>
-        <w:t>I split the data into training and test sets using an 80/20 ratio, making sure the test set kept the original class distribution so the evaluation would be realistic.</w:t>
+        <w:jc w:val="both"/>
+        <w:rPr>
+          <w:rFonts w:ascii="Times New Roman" w:hAnsi="Times New Roman" w:cs="Times New Roman"/>
+        </w:rPr>
+      </w:pPr>
+      <w:r>
+        <w:rPr>
+          <w:rFonts w:ascii="Times New Roman" w:hAnsi="Times New Roman" w:cs="Times New Roman"/>
+        </w:rPr>
+        <w:t>I performed an 80/20 stratified train/test split to preserve the original class distribution in the test set, ensuring realistic evaluation.</w:t>
       </w:r>
     </w:p>
     <w:p>
       <w:pPr>
         <w:numPr>
           <w:ilvl w:val="0"/>
-          <w:numId w:val="1"/>
+          <w:numId w:val="5"/>
         </w:numPr>
-        <w:rPr>
-          <w:rFonts w:ascii="Times New Roman" w:hAnsi="Times New Roman" w:cs="Times New Roman"/>
-        </w:rPr>
-      </w:pPr>
-      <w:r>
-        <w:rPr>
-          <w:rFonts w:ascii="Times New Roman" w:hAnsi="Times New Roman" w:cs="Times New Roman"/>
-        </w:rPr>
-        <w:t>Because the target variable (SHOOTING) was severely imbalanced (only 0.70% positive cases), I applied SMOTE only on the training set to bring the effective shooting rate up to 50% during training.</w:t>
+        <w:jc w:val="both"/>
+        <w:rPr>
+          <w:rFonts w:ascii="Times New Roman" w:hAnsi="Times New Roman" w:cs="Times New Roman"/>
+        </w:rPr>
+      </w:pPr>
+      <w:r>
+        <w:rPr>
+          <w:rFonts w:ascii="Times New Roman" w:hAnsi="Times New Roman" w:cs="Times New Roman"/>
+        </w:rPr>
+        <w:t>To address the extreme class imbalance (only 0.70% positive SHOOTING cases), I replaced the previously used SMOTE oversampling with </w:t>
+      </w:r>
+      <w:r>
+        <w:rPr>
+          <w:rFonts w:ascii="Times New Roman" w:hAnsi="Times New Roman" w:cs="Times New Roman"/>
+          <w:b/>
+          <w:bCs/>
+        </w:rPr>
+        <w:t>class</w:t>
+      </w:r>
+      <w:r>
+        <w:rPr>
+          <w:rFonts w:ascii="Times New Roman" w:hAnsi="Times New Roman" w:cs="Times New Roman"/>
+          <w:b/>
+          <w:bCs/>
+        </w:rPr>
+        <w:t xml:space="preserve"> </w:t>
+      </w:r>
+      <w:r>
+        <w:rPr>
+          <w:rFonts w:ascii="Times New Roman" w:hAnsi="Times New Roman" w:cs="Times New Roman"/>
+          <w:b/>
+          <w:bCs/>
+        </w:rPr>
+        <w:t>weighting</w:t>
+      </w:r>
+      <w:r>
+        <w:rPr>
+          <w:rFonts w:ascii="Times New Roman" w:hAnsi="Times New Roman" w:cs="Times New Roman"/>
+        </w:rPr>
+        <w:t> via</w:t>
+      </w:r>
+      <w:r>
+        <w:rPr>
+          <w:rFonts w:ascii="Times New Roman" w:hAnsi="Times New Roman" w:cs="Times New Roman"/>
+        </w:rPr>
+        <w:t xml:space="preserve"> </w:t>
+      </w:r>
+      <w:r>
+        <w:rPr>
+          <w:rFonts w:ascii="Times New Roman" w:hAnsi="Times New Roman" w:cs="Times New Roman"/>
+        </w:rPr>
+        <w:t>the </w:t>
+      </w:r>
+      <w:proofErr w:type="spellStart"/>
+      <w:r>
+        <w:rPr>
+          <w:rFonts w:ascii="Times New Roman" w:hAnsi="Times New Roman" w:cs="Times New Roman"/>
+        </w:rPr>
+        <w:t>scale_pos_weight</w:t>
+      </w:r>
+      <w:proofErr w:type="spellEnd"/>
+      <w:r>
+        <w:rPr>
+          <w:rFonts w:ascii="Times New Roman" w:hAnsi="Times New Roman" w:cs="Times New Roman"/>
+        </w:rPr>
+        <w:t xml:space="preserve"> parameter in </w:t>
+      </w:r>
+      <w:proofErr w:type="spellStart"/>
+      <w:r>
+        <w:rPr>
+          <w:rFonts w:ascii="Times New Roman" w:hAnsi="Times New Roman" w:cs="Times New Roman"/>
+        </w:rPr>
+        <w:t>XGBoost</w:t>
+      </w:r>
+      <w:proofErr w:type="spellEnd"/>
+      <w:r>
+        <w:rPr>
+          <w:rFonts w:ascii="Times New Roman" w:hAnsi="Times New Roman" w:cs="Times New Roman"/>
+        </w:rPr>
+        <w:t xml:space="preserve"> (calculated as 141.59). This approach trains the model on the original data distribution while giving higher importance to the minority class, which is more appropriate for real-world crime prediction where synthetic samples could introduce unrealistic patterns.</w:t>
       </w:r>
     </w:p>
     <w:p>
       <w:pPr>
         <w:numPr>
           <w:ilvl w:val="0"/>
-          <w:numId w:val="1"/>
+          <w:numId w:val="5"/>
         </w:numPr>
         <w:rPr>
           <w:rFonts w:ascii="Times New Roman" w:hAnsi="Times New Roman" w:cs="Times New Roman"/>
@@ -411,84 +448,53 @@
         <w:rPr>
           <w:rFonts w:ascii="Times New Roman" w:hAnsi="Times New Roman" w:cs="Times New Roman"/>
         </w:rPr>
-        <w:t xml:space="preserve">I trained the </w:t>
+        <w:t>I trained the model using reasonable baseline</w:t>
+      </w:r>
+      <w:r>
+        <w:rPr>
+          <w:rFonts w:ascii="Times New Roman" w:hAnsi="Times New Roman" w:cs="Times New Roman"/>
+        </w:rPr>
+        <w:t xml:space="preserve"> </w:t>
+      </w:r>
+      <w:r>
+        <w:rPr>
+          <w:rFonts w:ascii="Times New Roman" w:hAnsi="Times New Roman" w:cs="Times New Roman"/>
+        </w:rPr>
+        <w:t>hyperparameters: n_estimators=200, learning_rate=0.1, max_depth=6, subsample=0.8, and </w:t>
       </w:r>
       <w:proofErr w:type="spellStart"/>
       <w:r>
         <w:rPr>
           <w:rFonts w:ascii="Times New Roman" w:hAnsi="Times New Roman" w:cs="Times New Roman"/>
         </w:rPr>
-        <w:t>XGBoost</w:t>
+        <w:t>colsample_bytree</w:t>
       </w:r>
       <w:proofErr w:type="spellEnd"/>
       <w:r>
         <w:rPr>
           <w:rFonts w:ascii="Times New Roman" w:hAnsi="Times New Roman" w:cs="Times New Roman"/>
         </w:rPr>
-        <w:t xml:space="preserve"> model using reasonable default hyperparameters: </w:t>
-      </w:r>
-      <w:proofErr w:type="spellStart"/>
-      <w:r>
-        <w:rPr>
-          <w:rFonts w:ascii="Times New Roman" w:hAnsi="Times New Roman" w:cs="Times New Roman"/>
-        </w:rPr>
-        <w:t>n_estimators</w:t>
-      </w:r>
-      <w:proofErr w:type="spellEnd"/>
-      <w:r>
-        <w:rPr>
-          <w:rFonts w:ascii="Times New Roman" w:hAnsi="Times New Roman" w:cs="Times New Roman"/>
-        </w:rPr>
-        <w:t xml:space="preserve">=200, </w:t>
-      </w:r>
-      <w:proofErr w:type="spellStart"/>
-      <w:r>
-        <w:rPr>
-          <w:rFonts w:ascii="Times New Roman" w:hAnsi="Times New Roman" w:cs="Times New Roman"/>
-        </w:rPr>
-        <w:t>learning_rate</w:t>
-      </w:r>
-      <w:proofErr w:type="spellEnd"/>
-      <w:r>
-        <w:rPr>
-          <w:rFonts w:ascii="Times New Roman" w:hAnsi="Times New Roman" w:cs="Times New Roman"/>
-        </w:rPr>
-        <w:t xml:space="preserve">=0.1, and </w:t>
-      </w:r>
-      <w:proofErr w:type="spellStart"/>
-      <w:r>
-        <w:rPr>
-          <w:rFonts w:ascii="Times New Roman" w:hAnsi="Times New Roman" w:cs="Times New Roman"/>
-        </w:rPr>
-        <w:t>max_depth</w:t>
-      </w:r>
-      <w:proofErr w:type="spellEnd"/>
-      <w:r>
-        <w:rPr>
-          <w:rFonts w:ascii="Times New Roman" w:hAnsi="Times New Roman" w:cs="Times New Roman"/>
-        </w:rPr>
-        <w:t>=6.</w:t>
+        <w:t xml:space="preserve">=0.8. No hyperparameter tuning was performed at this </w:t>
+      </w:r>
+      <w:r>
+        <w:rPr>
+          <w:rFonts w:ascii="Times New Roman" w:hAnsi="Times New Roman" w:cs="Times New Roman"/>
+        </w:rPr>
+        <w:t>stage;</w:t>
+      </w:r>
+      <w:r>
+        <w:rPr>
+          <w:rFonts w:ascii="Times New Roman" w:hAnsi="Times New Roman" w:cs="Times New Roman"/>
+        </w:rPr>
+        <w:t xml:space="preserve"> the goal was to establish a true baseline performance level.</w:t>
       </w:r>
     </w:p>
     <w:p>
       <w:pPr>
         <w:numPr>
           <w:ilvl w:val="0"/>
-          <w:numId w:val="1"/>
+          <w:numId w:val="5"/>
         </w:numPr>
-        <w:rPr>
-          <w:rFonts w:ascii="Times New Roman" w:hAnsi="Times New Roman" w:cs="Times New Roman"/>
-        </w:rPr>
-      </w:pPr>
-      <w:r>
-        <w:rPr>
-          <w:rFonts w:ascii="Times New Roman" w:hAnsi="Times New Roman" w:cs="Times New Roman"/>
-        </w:rPr>
-        <w:t>I used Precision-Recall AUC as the primary evaluation metric because accuracy would be misleading with such a rare event.</w:t>
-      </w:r>
-    </w:p>
-    <w:p>
-      <w:pPr>
         <w:jc w:val="both"/>
         <w:rPr>
           <w:rFonts w:ascii="Times New Roman" w:hAnsi="Times New Roman" w:cs="Times New Roman"/>
@@ -498,85 +504,57 @@
         <w:rPr>
           <w:rFonts w:ascii="Times New Roman" w:hAnsi="Times New Roman" w:cs="Times New Roman"/>
         </w:rPr>
-        <w:t>I did not perform any hyperparameter tuning yet — this was intentionally a true baseline to establish a starting performance level and confirm that the feature engineering work was on the right track.</w:t>
-      </w:r>
-    </w:p>
-    <w:p>
-      <w:pPr>
-        <w:rPr>
-          <w:rFonts w:ascii="Times New Roman" w:hAnsi="Times New Roman" w:cs="Times New Roman"/>
-        </w:rPr>
-      </w:pPr>
-      <w:r>
-        <w:rPr>
-          <w:rFonts w:ascii="Times New Roman" w:hAnsi="Times New Roman" w:cs="Times New Roman"/>
-        </w:rPr>
-        <w:t>I also made a few explicit assumptions:</w:t>
-      </w:r>
-    </w:p>
-    <w:p>
-      <w:pPr>
-        <w:numPr>
-          <w:ilvl w:val="0"/>
-          <w:numId w:val="2"/>
-        </w:numPr>
-        <w:rPr>
-          <w:rFonts w:ascii="Times New Roman" w:hAnsi="Times New Roman" w:cs="Times New Roman"/>
-        </w:rPr>
-      </w:pPr>
-      <w:r>
-        <w:rPr>
-          <w:rFonts w:ascii="Times New Roman" w:hAnsi="Times New Roman" w:cs="Times New Roman"/>
-        </w:rPr>
-        <w:t>The engineered features (night indicator, poverty rate, district encoding, etc.) capture the most important risk signals.</w:t>
-      </w:r>
-    </w:p>
-    <w:p>
-      <w:pPr>
-        <w:numPr>
-          <w:ilvl w:val="0"/>
-          <w:numId w:val="2"/>
-        </w:numPr>
-        <w:rPr>
-          <w:rFonts w:ascii="Times New Roman" w:hAnsi="Times New Roman" w:cs="Times New Roman"/>
-        </w:rPr>
-      </w:pPr>
-      <w:r>
-        <w:rPr>
-          <w:rFonts w:ascii="Times New Roman" w:hAnsi="Times New Roman" w:cs="Times New Roman"/>
-        </w:rPr>
-        <w:t>The data from 2023–present is representative enough for the model to generalize to future incidents.</w:t>
-      </w:r>
-    </w:p>
-    <w:p>
-      <w:pPr>
-        <w:numPr>
-          <w:ilvl w:val="0"/>
-          <w:numId w:val="2"/>
-        </w:numPr>
-        <w:rPr>
-          <w:rFonts w:ascii="Times New Roman" w:hAnsi="Times New Roman" w:cs="Times New Roman"/>
-        </w:rPr>
-      </w:pPr>
-      <w:r>
-        <w:rPr>
-          <w:rFonts w:ascii="Times New Roman" w:hAnsi="Times New Roman" w:cs="Times New Roman"/>
-        </w:rPr>
-        <w:t>Interpretability is more important than squeezing out every last bit of performance, so I avoided complex dimensionality reduction techniques like PCA.</w:t>
-      </w:r>
-    </w:p>
-    <w:p>
-      <w:pPr>
-        <w:rPr>
-          <w:rFonts w:ascii="Times New Roman" w:hAnsi="Times New Roman" w:cs="Times New Roman"/>
-        </w:rPr>
-      </w:pPr>
-      <w:r>
-        <w:rPr>
-          <w:rFonts w:ascii="Times New Roman" w:hAnsi="Times New Roman" w:cs="Times New Roman"/>
-        </w:rPr>
-        <w:t>All code for this baseline is saved in Notebook 03 and the trained model is saved in the models/ folder.</w:t>
-      </w:r>
+        <w:t>I evaluated the model exclusively using Precision-Recall AUC and the classification report on the original imbalanced test set.</w:t>
+      </w:r>
+    </w:p>
+    <w:p>
+      <w:pPr>
+        <w:jc w:val="both"/>
+        <w:rPr>
+          <w:rFonts w:ascii="Times New Roman" w:hAnsi="Times New Roman" w:cs="Times New Roman"/>
+        </w:rPr>
+      </w:pPr>
+      <w:r>
+        <w:rPr>
+          <w:rFonts w:ascii="Times New Roman" w:hAnsi="Times New Roman" w:cs="Times New Roman"/>
+        </w:rPr>
+        <w:t>All code for this phase is contained in Notebook 03 and the modular Python scripts in the </w:t>
+      </w:r>
+      <w:proofErr w:type="spellStart"/>
+      <w:r>
+        <w:rPr>
+          <w:rFonts w:ascii="Times New Roman" w:hAnsi="Times New Roman" w:cs="Times New Roman"/>
+        </w:rPr>
+        <w:t>src</w:t>
+      </w:r>
+      <w:proofErr w:type="spellEnd"/>
+      <w:r>
+        <w:rPr>
+          <w:rFonts w:ascii="Times New Roman" w:hAnsi="Times New Roman" w:cs="Times New Roman"/>
+        </w:rPr>
+        <w:t>/ folder. The trained model and SHAP plots are saved in the models/ folder. The entire pipeline can now be executed with a single command using run_all.py.</w:t>
+      </w:r>
+    </w:p>
+    <w:p>
+      <w:pPr>
+        <w:rPr>
+          <w:rFonts w:ascii="Times New Roman" w:hAnsi="Times New Roman" w:cs="Times New Roman"/>
+        </w:rPr>
+      </w:pPr>
+    </w:p>
+    <w:p>
+      <w:pPr>
+        <w:rPr>
+          <w:rFonts w:ascii="Times New Roman" w:hAnsi="Times New Roman" w:cs="Times New Roman"/>
+        </w:rPr>
+      </w:pPr>
+    </w:p>
+    <w:p>
+      <w:pPr>
+        <w:rPr>
+          <w:rFonts w:ascii="Times New Roman" w:hAnsi="Times New Roman" w:cs="Times New Roman"/>
+        </w:rPr>
+      </w:pPr>
     </w:p>
     <w:p>
       <w:pPr>
@@ -653,7 +631,7 @@
         <w:rPr>
           <w:rFonts w:ascii="Times New Roman" w:hAnsi="Times New Roman" w:cs="Times New Roman"/>
         </w:rPr>
-        <w:t xml:space="preserve"> model achieved a </w:t>
+        <w:t xml:space="preserve"> model with class weighting achieved a </w:t>
       </w:r>
       <w:r>
         <w:rPr>
@@ -661,81 +639,101 @@
           <w:b/>
           <w:bCs/>
         </w:rPr>
-        <w:t>Precision-Recall AUC of 0.8327</w:t>
-      </w:r>
-      <w:r>
-        <w:rPr>
-          <w:rFonts w:ascii="Times New Roman" w:hAnsi="Times New Roman" w:cs="Times New Roman"/>
-        </w:rPr>
-        <w:t>. For a first attempt on such an imbalanced dataset, this is a solid result and shows that the features we engineered are carrying meaningful predictive signal.</w:t>
-      </w:r>
-    </w:p>
-    <w:p>
-      <w:pPr>
-        <w:rPr>
-          <w:rFonts w:ascii="Times New Roman" w:hAnsi="Times New Roman" w:cs="Times New Roman"/>
-        </w:rPr>
-      </w:pPr>
-      <w:r>
-        <w:rPr>
-          <w:rFonts w:ascii="Times New Roman" w:hAnsi="Times New Roman" w:cs="Times New Roman"/>
-        </w:rPr>
-        <w:t>SHAP analysis provided clear and actionable insights:</w:t>
+        <w:t>Precision-Recall AUC of 0.8378</w:t>
+      </w:r>
+      <w:r>
+        <w:rPr>
+          <w:rFonts w:ascii="Times New Roman" w:hAnsi="Times New Roman" w:cs="Times New Roman"/>
+        </w:rPr>
+        <w:t>. This result is encouraging for a first baseline and represents a slight improvement over the previous SMOTE-based version, confirming that the engineered features are carrying meaningful predictive signal.</w:t>
+      </w:r>
+    </w:p>
+    <w:p>
+      <w:pPr>
+        <w:jc w:val="both"/>
+        <w:rPr>
+          <w:rFonts w:ascii="Times New Roman" w:hAnsi="Times New Roman" w:cs="Times New Roman"/>
+        </w:rPr>
+      </w:pPr>
+      <w:r>
+        <w:rPr>
+          <w:rFonts w:ascii="Times New Roman" w:hAnsi="Times New Roman" w:cs="Times New Roman"/>
+        </w:rPr>
+        <w:t>The classification report on the test set showed strong performance on the majority class while maintaining reasonable recall on the rare positive class. SHAP analysis provided clear and actionable insights:</w:t>
       </w:r>
     </w:p>
     <w:p>
       <w:pPr>
         <w:numPr>
           <w:ilvl w:val="0"/>
-          <w:numId w:val="3"/>
+          <w:numId w:val="6"/>
         </w:numPr>
-        <w:rPr>
-          <w:rFonts w:ascii="Times New Roman" w:hAnsi="Times New Roman" w:cs="Times New Roman"/>
-        </w:rPr>
-      </w:pPr>
-      <w:r>
-        <w:rPr>
-          <w:rFonts w:ascii="Times New Roman" w:hAnsi="Times New Roman" w:cs="Times New Roman"/>
-        </w:rPr>
-        <w:t>Poverty Rate stood out as the single most influential feature.</w:t>
+        <w:jc w:val="both"/>
+        <w:rPr>
+          <w:rFonts w:ascii="Times New Roman" w:hAnsi="Times New Roman" w:cs="Times New Roman"/>
+        </w:rPr>
+      </w:pPr>
+      <w:r>
+        <w:rPr>
+          <w:rFonts w:ascii="Times New Roman" w:hAnsi="Times New Roman" w:cs="Times New Roman"/>
+          <w:b/>
+          <w:bCs/>
+        </w:rPr>
+        <w:t>Poverty rate</w:t>
+      </w:r>
+      <w:r>
+        <w:rPr>
+          <w:rFonts w:ascii="Times New Roman" w:hAnsi="Times New Roman" w:cs="Times New Roman"/>
+        </w:rPr>
+        <w:t> emerged as the single most influential feature, validating the inclusion of district-level ACS data.</w:t>
       </w:r>
     </w:p>
     <w:p>
       <w:pPr>
         <w:numPr>
           <w:ilvl w:val="0"/>
-          <w:numId w:val="3"/>
+          <w:numId w:val="6"/>
         </w:numPr>
-        <w:rPr>
-          <w:rFonts w:ascii="Times New Roman" w:hAnsi="Times New Roman" w:cs="Times New Roman"/>
-        </w:rPr>
-      </w:pPr>
-      <w:r>
-        <w:rPr>
-          <w:rFonts w:ascii="Times New Roman" w:hAnsi="Times New Roman" w:cs="Times New Roman"/>
-        </w:rPr>
-        <w:t>Hour of Day and the Is Night indicator were the next strongest predictors, confirming the strong temporal pattern we expected.</w:t>
+        <w:jc w:val="both"/>
+        <w:rPr>
+          <w:rFonts w:ascii="Times New Roman" w:hAnsi="Times New Roman" w:cs="Times New Roman"/>
+        </w:rPr>
+      </w:pPr>
+      <w:r>
+        <w:rPr>
+          <w:rFonts w:ascii="Times New Roman" w:hAnsi="Times New Roman" w:cs="Times New Roman"/>
+          <w:b/>
+          <w:bCs/>
+        </w:rPr>
+        <w:t>Hour of day</w:t>
+      </w:r>
+      <w:r>
+        <w:rPr>
+          <w:rFonts w:ascii="Times New Roman" w:hAnsi="Times New Roman" w:cs="Times New Roman"/>
+        </w:rPr>
+        <w:t> and the binary </w:t>
+      </w:r>
+      <w:proofErr w:type="spellStart"/>
+      <w:r>
+        <w:rPr>
+          <w:rFonts w:ascii="Times New Roman" w:hAnsi="Times New Roman" w:cs="Times New Roman"/>
+        </w:rPr>
+        <w:t>is_night</w:t>
+      </w:r>
+      <w:proofErr w:type="spellEnd"/>
+      <w:r>
+        <w:rPr>
+          <w:rFonts w:ascii="Times New Roman" w:hAnsi="Times New Roman" w:cs="Times New Roman"/>
+        </w:rPr>
+        <w:t> indicator were the next strongest predictors, reinforcing the strong temporal patterns identified during EDA.</w:t>
       </w:r>
     </w:p>
     <w:p>
       <w:pPr>
         <w:numPr>
           <w:ilvl w:val="0"/>
-          <w:numId w:val="3"/>
+          <w:numId w:val="6"/>
         </w:numPr>
-        <w:rPr>
-          <w:rFonts w:ascii="Times New Roman" w:hAnsi="Times New Roman" w:cs="Times New Roman"/>
-        </w:rPr>
-      </w:pPr>
-      <w:r>
-        <w:rPr>
-          <w:rFonts w:ascii="Times New Roman" w:hAnsi="Times New Roman" w:cs="Times New Roman"/>
-        </w:rPr>
-        <w:t>Certain districts (especially B2 and A7) also contributed noticeably to the predictions.</w:t>
-      </w:r>
-    </w:p>
-    <w:p>
-      <w:pPr>
         <w:jc w:val="both"/>
         <w:rPr>
           <w:rFonts w:ascii="Times New Roman" w:hAnsi="Times New Roman" w:cs="Times New Roman"/>
@@ -745,7 +743,7 @@
         <w:rPr>
           <w:rFonts w:ascii="Times New Roman" w:hAnsi="Times New Roman" w:cs="Times New Roman"/>
         </w:rPr>
-        <w:t>These findings align well with the original hypothesis. Nighttime incidents in higher-poverty areas do show significantly higher shooting risk, and the model is already picking up on those patterns. I also compared training and test performance and found the gap to be reasonable, suggesting the baseline is not severely overfitting at this stage.</w:t>
+        <w:t>Certain districts (particularly B2 and A7) also contributed noticeably to the predictions.</w:t>
       </w:r>
     </w:p>
     <w:p>
@@ -759,7 +757,7 @@
         <w:rPr>
           <w:rFonts w:ascii="Times New Roman" w:hAnsi="Times New Roman" w:cs="Times New Roman"/>
         </w:rPr>
-        <w:t xml:space="preserve">To help visualize the results, I created a SHAP summary bar chart and a </w:t>
+        <w:t xml:space="preserve">These findings align closely with the original hypothesis: nighttime incidents in higher-poverty districts carry substantially elevated shooting risk. The SHAP summary bar chart and </w:t>
       </w:r>
       <w:proofErr w:type="spellStart"/>
       <w:r>
@@ -773,16 +771,8 @@
         <w:rPr>
           <w:rFonts w:ascii="Times New Roman" w:hAnsi="Times New Roman" w:cs="Times New Roman"/>
         </w:rPr>
-        <w:t xml:space="preserve"> plot (both saved in the visualizations folder). These plots make it easy to see which features are driving the predictions and in which direction. For the crime lab, this level of explainability is just as important as the raw performance numbers.</w:t>
-      </w:r>
-    </w:p>
-    <w:p>
-      <w:pPr>
-        <w:jc w:val="both"/>
-        <w:rPr>
-          <w:rFonts w:ascii="Times New Roman" w:hAnsi="Times New Roman" w:cs="Times New Roman"/>
-        </w:rPr>
-      </w:pPr>
+        <w:t xml:space="preserve"> plot (saved in the models/ folder) make these relationships visually interpretable for stakeholders. Overall, the model is already identifying the exact combinations of time, location, and socioeconomic factors that the crime laboratory would want to prioritize for immediate forensic attention.</w:t>
+      </w:r>
     </w:p>
     <w:p>
       <w:pPr>
@@ -904,36 +894,35 @@
     </w:p>
     <w:p>
       <w:pPr>
-        <w:jc w:val="both"/>
-        <w:rPr>
-          <w:rFonts w:ascii="Times New Roman" w:hAnsi="Times New Roman" w:cs="Times New Roman"/>
-        </w:rPr>
-      </w:pPr>
-      <w:r>
-        <w:rPr>
-          <w:rFonts w:ascii="Times New Roman" w:hAnsi="Times New Roman" w:cs="Times New Roman"/>
-        </w:rPr>
-        <w:t>Overall, the baseline model confirms that the data preparation and feature engineering steps were effective. The Precision-Recall AUC of 0.8327 is encouraging, and the SHAP results match both criminological expectations and the practical knowledge shared by police officers and forensic examiners. The model is already identifying the kinds of incidents we hoped it would flag as high-risk.</w:t>
-      </w:r>
-    </w:p>
-    <w:p>
-      <w:pPr>
-        <w:rPr>
-          <w:rFonts w:ascii="Times New Roman" w:hAnsi="Times New Roman" w:cs="Times New Roman"/>
-        </w:rPr>
-      </w:pPr>
-      <w:r>
-        <w:rPr>
-          <w:rFonts w:ascii="Times New Roman" w:hAnsi="Times New Roman" w:cs="Times New Roman"/>
-        </w:rPr>
-        <w:t>That said, there is still plenty of room to improve. The next steps I plan to take are:</w:t>
+        <w:rPr>
+          <w:rFonts w:ascii="Times New Roman" w:hAnsi="Times New Roman" w:cs="Times New Roman"/>
+        </w:rPr>
+      </w:pPr>
+      <w:r>
+        <w:rPr>
+          <w:rFonts w:ascii="Times New Roman" w:hAnsi="Times New Roman" w:cs="Times New Roman"/>
+        </w:rPr>
+        <w:t>This baseline modeling phase confirms that the extensive preprocessing and feature engineering work completed earlier was effective. The model is learning meaningful, criminologically plausible patterns rather than noise or spurious correlations.</w:t>
+      </w:r>
+    </w:p>
+    <w:p>
+      <w:pPr>
+        <w:rPr>
+          <w:rFonts w:ascii="Times New Roman" w:hAnsi="Times New Roman" w:cs="Times New Roman"/>
+        </w:rPr>
+      </w:pPr>
+      <w:r>
+        <w:rPr>
+          <w:rFonts w:ascii="Times New Roman" w:hAnsi="Times New Roman" w:cs="Times New Roman"/>
+        </w:rPr>
+        <w:t>However, several important limitations and assumptions must be explicitly acknowledged in light of the proposal feedback:</w:t>
       </w:r>
     </w:p>
     <w:p>
       <w:pPr>
         <w:numPr>
           <w:ilvl w:val="0"/>
-          <w:numId w:val="4"/>
+          <w:numId w:val="7"/>
         </w:numPr>
         <w:rPr>
           <w:rFonts w:ascii="Times New Roman" w:hAnsi="Times New Roman" w:cs="Times New Roman"/>
@@ -942,15 +931,23 @@
       <w:r>
         <w:rPr>
           <w:rFonts w:ascii="Times New Roman" w:hAnsi="Times New Roman" w:cs="Times New Roman"/>
-        </w:rPr>
-        <w:t>Systematic hyperparameter tuning using cross-validation to see how much performance we can gain.</w:t>
+          <w:b/>
+          <w:bCs/>
+        </w:rPr>
+        <w:t>Label timing assumption</w:t>
+      </w:r>
+      <w:r>
+        <w:rPr>
+          <w:rFonts w:ascii="Times New Roman" w:hAnsi="Times New Roman" w:cs="Times New Roman"/>
+        </w:rPr>
+        <w:t>: The target variable is derived from the time the incident was reported rather than the time a shooting was confirmed. In a real deployment, this could introduce a small lag between prediction and ground truth. I will clearly communicate this limitation to stakeholders and explore mitigation strategies such as confidence thresholds or real-time model updates.</w:t>
       </w:r>
     </w:p>
     <w:p>
       <w:pPr>
         <w:numPr>
           <w:ilvl w:val="0"/>
-          <w:numId w:val="4"/>
+          <w:numId w:val="7"/>
         </w:numPr>
         <w:rPr>
           <w:rFonts w:ascii="Times New Roman" w:hAnsi="Times New Roman" w:cs="Times New Roman"/>
@@ -959,29 +956,37 @@
       <w:r>
         <w:rPr>
           <w:rFonts w:ascii="Times New Roman" w:hAnsi="Times New Roman" w:cs="Times New Roman"/>
-        </w:rPr>
-        <w:t xml:space="preserve">Testing a couple of additional models (Random Forest and </w:t>
+          <w:b/>
+          <w:bCs/>
+        </w:rPr>
+        <w:t>Potential leakage from proxy variables</w:t>
+      </w:r>
+      <w:r>
+        <w:rPr>
+          <w:rFonts w:ascii="Times New Roman" w:hAnsi="Times New Roman" w:cs="Times New Roman"/>
+        </w:rPr>
+        <w:t>: The engineered </w:t>
       </w:r>
       <w:proofErr w:type="spellStart"/>
       <w:r>
         <w:rPr>
           <w:rFonts w:ascii="Times New Roman" w:hAnsi="Times New Roman" w:cs="Times New Roman"/>
         </w:rPr>
-        <w:t>LightGBM</w:t>
+        <w:t>is_violent</w:t>
       </w:r>
       <w:proofErr w:type="spellEnd"/>
       <w:r>
         <w:rPr>
           <w:rFonts w:ascii="Times New Roman" w:hAnsi="Times New Roman" w:cs="Times New Roman"/>
         </w:rPr>
-        <w:t>) for comparison.</w:t>
+        <w:t> flag and OFFENSE_CODE_GROUP are derived from the same incident data as the target. While useful, they carry a risk of data leakage. Future iterations will include ablation tests (removing these proxies) to quantify their contribution versus true predictive power.</w:t>
       </w:r>
     </w:p>
     <w:p>
       <w:pPr>
         <w:numPr>
           <w:ilvl w:val="0"/>
-          <w:numId w:val="4"/>
+          <w:numId w:val="7"/>
         </w:numPr>
         <w:rPr>
           <w:rFonts w:ascii="Times New Roman" w:hAnsi="Times New Roman" w:cs="Times New Roman"/>
@@ -990,15 +995,23 @@
       <w:r>
         <w:rPr>
           <w:rFonts w:ascii="Times New Roman" w:hAnsi="Times New Roman" w:cs="Times New Roman"/>
-        </w:rPr>
-        <w:t>Applying stronger regularization and early stopping to further control overfitting.</w:t>
+          <w:b/>
+          <w:bCs/>
+        </w:rPr>
+        <w:t>Temporal and geographic structure</w:t>
+      </w:r>
+      <w:r>
+        <w:rPr>
+          <w:rFonts w:ascii="Times New Roman" w:hAnsi="Times New Roman" w:cs="Times New Roman"/>
+        </w:rPr>
+        <w:t>: The data contains both year-to-year and district-level patterns. Circular time encoding and district one-hot encoding help mitigate some of this structure, but there remains a risk that the model learns location-specific or year-specific patterns rather than generalizable drivers. I plan to explore lagged temporal features and geography-aware validation splits in the next phase.</w:t>
       </w:r>
     </w:p>
     <w:p>
       <w:pPr>
         <w:numPr>
           <w:ilvl w:val="0"/>
-          <w:numId w:val="4"/>
+          <w:numId w:val="7"/>
         </w:numPr>
         <w:rPr>
           <w:rFonts w:ascii="Times New Roman" w:hAnsi="Times New Roman" w:cs="Times New Roman"/>
@@ -1007,15 +1020,44 @@
       <w:r>
         <w:rPr>
           <w:rFonts w:ascii="Times New Roman" w:hAnsi="Times New Roman" w:cs="Times New Roman"/>
-        </w:rPr>
-        <w:t>Creating more detailed SHAP dependence plots and force plots so the crime lab can understand individual predictions.</w:t>
+          <w:b/>
+          <w:bCs/>
+        </w:rPr>
+        <w:t>Fairness considerations</w:t>
+      </w:r>
+      <w:r>
+        <w:rPr>
+          <w:rFonts w:ascii="Times New Roman" w:hAnsi="Times New Roman" w:cs="Times New Roman"/>
+        </w:rPr>
+        <w:t>: Because the model incorporates district-level poverty, there is a potential risk of reinforcing existing socioeconomic inequalities. I will conduct explicit fairness evaluations (performance stratified by district and nighttime) and define maximum acceptable disparity thresholds across groups.</w:t>
+      </w:r>
+    </w:p>
+    <w:p>
+      <w:pPr>
+        <w:rPr>
+          <w:rFonts w:ascii="Times New Roman" w:hAnsi="Times New Roman" w:cs="Times New Roman"/>
+        </w:rPr>
+      </w:pPr>
+      <w:r>
+        <w:rPr>
+          <w:rFonts w:ascii="Times New Roman" w:hAnsi="Times New Roman" w:cs="Times New Roman"/>
+          <w:b/>
+          <w:bCs/>
+        </w:rPr>
+        <w:t>Next steps</w:t>
+      </w:r>
+      <w:r>
+        <w:rPr>
+          <w:rFonts w:ascii="Times New Roman" w:hAnsi="Times New Roman" w:cs="Times New Roman"/>
+        </w:rPr>
+        <w:t> before final delivery include:</w:t>
       </w:r>
     </w:p>
     <w:p>
       <w:pPr>
         <w:numPr>
           <w:ilvl w:val="0"/>
-          <w:numId w:val="4"/>
+          <w:numId w:val="8"/>
         </w:numPr>
         <w:rPr>
           <w:rFonts w:ascii="Times New Roman" w:hAnsi="Times New Roman" w:cs="Times New Roman"/>
@@ -1025,35 +1067,120 @@
         <w:rPr>
           <w:rFonts w:ascii="Times New Roman" w:hAnsi="Times New Roman" w:cs="Times New Roman"/>
         </w:rPr>
-        <w:t>Integrating the final model into the Tableau dashboard so users can explore risk scores and explanations interactively.</w:t>
-      </w:r>
-    </w:p>
-    <w:p>
-      <w:pPr>
-        <w:jc w:val="both"/>
-        <w:rPr>
-          <w:rFonts w:ascii="Times New Roman" w:hAnsi="Times New Roman" w:cs="Times New Roman"/>
-        </w:rPr>
-      </w:pPr>
-      <w:r>
-        <w:rPr>
-          <w:rFonts w:ascii="Times New Roman" w:hAnsi="Times New Roman" w:cs="Times New Roman"/>
-        </w:rPr>
-        <w:t>I will also revisit the analysis plan to make sure the next phase stays aligned with stakeholder needs. The goal is not just a high-performing model, but one that the Massachusetts State Police Crime Laboratory and Boston Police Department can actually trust and use in daily operations.</w:t>
-      </w:r>
-    </w:p>
-    <w:p>
-      <w:pPr>
-        <w:jc w:val="both"/>
-        <w:rPr>
-          <w:rFonts w:ascii="Times New Roman" w:hAnsi="Times New Roman" w:cs="Times New Roman"/>
-        </w:rPr>
-      </w:pPr>
-      <w:r>
-        <w:rPr>
-          <w:rFonts w:ascii="Times New Roman" w:hAnsi="Times New Roman" w:cs="Times New Roman"/>
-        </w:rPr>
-        <w:t>This baseline has given us a clear and promising foundation. I’m looking forward to refining the model further and delivering a practical triage tool that can help speed up forensic work and improve public safety in Boston.</w:t>
+        <w:t>Systematic hyperparameter tuning using cross-validation.</w:t>
+      </w:r>
+    </w:p>
+    <w:p>
+      <w:pPr>
+        <w:numPr>
+          <w:ilvl w:val="0"/>
+          <w:numId w:val="8"/>
+        </w:numPr>
+        <w:rPr>
+          <w:rFonts w:ascii="Times New Roman" w:hAnsi="Times New Roman" w:cs="Times New Roman"/>
+        </w:rPr>
+      </w:pPr>
+      <w:r>
+        <w:rPr>
+          <w:rFonts w:ascii="Times New Roman" w:hAnsi="Times New Roman" w:cs="Times New Roman"/>
+        </w:rPr>
+        <w:t xml:space="preserve">Comparison against Random Forest and </w:t>
+      </w:r>
+      <w:proofErr w:type="spellStart"/>
+      <w:r>
+        <w:rPr>
+          <w:rFonts w:ascii="Times New Roman" w:hAnsi="Times New Roman" w:cs="Times New Roman"/>
+        </w:rPr>
+        <w:t>LightGBM</w:t>
+      </w:r>
+      <w:proofErr w:type="spellEnd"/>
+      <w:r>
+        <w:rPr>
+          <w:rFonts w:ascii="Times New Roman" w:hAnsi="Times New Roman" w:cs="Times New Roman"/>
+        </w:rPr>
+        <w:t xml:space="preserve"> models.</w:t>
+      </w:r>
+    </w:p>
+    <w:p>
+      <w:pPr>
+        <w:numPr>
+          <w:ilvl w:val="0"/>
+          <w:numId w:val="8"/>
+        </w:numPr>
+        <w:rPr>
+          <w:rFonts w:ascii="Times New Roman" w:hAnsi="Times New Roman" w:cs="Times New Roman"/>
+        </w:rPr>
+      </w:pPr>
+      <w:r>
+        <w:rPr>
+          <w:rFonts w:ascii="Times New Roman" w:hAnsi="Times New Roman" w:cs="Times New Roman"/>
+        </w:rPr>
+        <w:t>Explicit fairness diagnostics and leakage tests.</w:t>
+      </w:r>
+    </w:p>
+    <w:p>
+      <w:pPr>
+        <w:numPr>
+          <w:ilvl w:val="0"/>
+          <w:numId w:val="8"/>
+        </w:numPr>
+        <w:rPr>
+          <w:rFonts w:ascii="Times New Roman" w:hAnsi="Times New Roman" w:cs="Times New Roman"/>
+        </w:rPr>
+      </w:pPr>
+      <w:r>
+        <w:rPr>
+          <w:rFonts w:ascii="Times New Roman" w:hAnsi="Times New Roman" w:cs="Times New Roman"/>
+        </w:rPr>
+        <w:t>Addition of more granular ACS neighborhood variables (economic health, wellness, education) beyond the current poverty-rate proxy.</w:t>
+      </w:r>
+    </w:p>
+    <w:p>
+      <w:pPr>
+        <w:numPr>
+          <w:ilvl w:val="0"/>
+          <w:numId w:val="8"/>
+        </w:numPr>
+        <w:rPr>
+          <w:rFonts w:ascii="Times New Roman" w:hAnsi="Times New Roman" w:cs="Times New Roman"/>
+        </w:rPr>
+      </w:pPr>
+      <w:r>
+        <w:rPr>
+          <w:rFonts w:ascii="Times New Roman" w:hAnsi="Times New Roman" w:cs="Times New Roman"/>
+        </w:rPr>
+        <w:t>Creation of additional SHAP dependence plots and individual prediction explanations.</w:t>
+      </w:r>
+    </w:p>
+    <w:p>
+      <w:pPr>
+        <w:numPr>
+          <w:ilvl w:val="0"/>
+          <w:numId w:val="8"/>
+        </w:numPr>
+        <w:rPr>
+          <w:rFonts w:ascii="Times New Roman" w:hAnsi="Times New Roman" w:cs="Times New Roman"/>
+        </w:rPr>
+      </w:pPr>
+      <w:r>
+        <w:rPr>
+          <w:rFonts w:ascii="Times New Roman" w:hAnsi="Times New Roman" w:cs="Times New Roman"/>
+        </w:rPr>
+        <w:t>Final integration of the model into the interactive Tableau dashboard.</w:t>
+      </w:r>
+    </w:p>
+    <w:p>
+      <w:pPr>
+        <w:rPr>
+          <w:rFonts w:ascii="Times New Roman" w:hAnsi="Times New Roman" w:cs="Times New Roman"/>
+        </w:rPr>
+      </w:pPr>
+      <w:r>
+        <w:rPr>
+          <w:rFonts w:ascii="Times New Roman" w:hAnsi="Times New Roman" w:cs="Times New Roman"/>
+        </w:rPr>
+        <w:lastRenderedPageBreak/>
+        <w:t>This baseline has provided a strong, explainable foundation. By directly addressing the feedback on class imbalance handling, leakage risks, temporal/geographic structure, and fairness, I am confident the final model will be both accurate and operationally trustworthy for the Massachusetts State Police Crime Laboratory and Boston Police Department.</w:t>
       </w:r>
     </w:p>
     <w:p>
@@ -1139,7 +1266,42 @@
         <w:rPr>
           <w:rFonts w:ascii="Times New Roman" w:hAnsi="Times New Roman" w:cs="Times New Roman"/>
         </w:rPr>
-        <w:t>All code, models, and SHAP plots are saved in the repository under the notebooks/, models/, and visualizations/ folders.</w:t>
+        <w:t>All code, models, and SHAP plots are available in the repository under the notebooks/, </w:t>
+      </w:r>
+      <w:proofErr w:type="spellStart"/>
+      <w:r>
+        <w:rPr>
+          <w:rFonts w:ascii="Times New Roman" w:hAnsi="Times New Roman" w:cs="Times New Roman"/>
+        </w:rPr>
+        <w:t>src</w:t>
+      </w:r>
+      <w:proofErr w:type="spellEnd"/>
+      <w:r>
+        <w:rPr>
+          <w:rFonts w:ascii="Times New Roman" w:hAnsi="Times New Roman" w:cs="Times New Roman"/>
+        </w:rPr>
+        <w:t>/, models/, and visualizations/ folders.</w:t>
+      </w:r>
+    </w:p>
+    <w:p>
+      <w:pPr>
+        <w:rPr>
+          <w:rFonts w:ascii="Times New Roman" w:hAnsi="Times New Roman" w:cs="Times New Roman"/>
+        </w:rPr>
+      </w:pPr>
+      <w:r>
+        <w:rPr>
+          <w:rFonts w:ascii="Times New Roman" w:hAnsi="Times New Roman" w:cs="Times New Roman"/>
+          <w:b/>
+          <w:bCs/>
+        </w:rPr>
+        <w:t>Last updated</w:t>
+      </w:r>
+      <w:r>
+        <w:rPr>
+          <w:rFonts w:ascii="Times New Roman" w:hAnsi="Times New Roman" w:cs="Times New Roman"/>
+        </w:rPr>
+        <w:t>: April 2026</w:t>
       </w:r>
     </w:p>
     <w:p/>
@@ -1305,6 +1467,119 @@
     </w:lvl>
   </w:abstractNum>
   <w:abstractNum w:abstractNumId="1" w15:restartNumberingAfterBreak="0">
+    <w:nsid w:val="1153629F"/>
+    <w:multiLevelType w:val="multilevel"/>
+    <w:tmpl w:val="751C55F4"/>
+    <w:lvl w:ilvl="0">
+      <w:start w:val="1"/>
+      <w:numFmt w:val="decimal"/>
+      <w:lvlText w:val="%1."/>
+      <w:lvlJc w:val="left"/>
+      <w:pPr>
+        <w:tabs>
+          <w:tab w:val="num" w:pos="720"/>
+        </w:tabs>
+        <w:ind w:left="720" w:hanging="360"/>
+      </w:pPr>
+    </w:lvl>
+    <w:lvl w:ilvl="1" w:tentative="1">
+      <w:start w:val="1"/>
+      <w:numFmt w:val="decimal"/>
+      <w:lvlText w:val="%2."/>
+      <w:lvlJc w:val="left"/>
+      <w:pPr>
+        <w:tabs>
+          <w:tab w:val="num" w:pos="1440"/>
+        </w:tabs>
+        <w:ind w:left="1440" w:hanging="360"/>
+      </w:pPr>
+    </w:lvl>
+    <w:lvl w:ilvl="2" w:tentative="1">
+      <w:start w:val="1"/>
+      <w:numFmt w:val="decimal"/>
+      <w:lvlText w:val="%3."/>
+      <w:lvlJc w:val="left"/>
+      <w:pPr>
+        <w:tabs>
+          <w:tab w:val="num" w:pos="2160"/>
+        </w:tabs>
+        <w:ind w:left="2160" w:hanging="360"/>
+      </w:pPr>
+    </w:lvl>
+    <w:lvl w:ilvl="3" w:tentative="1">
+      <w:start w:val="1"/>
+      <w:numFmt w:val="decimal"/>
+      <w:lvlText w:val="%4."/>
+      <w:lvlJc w:val="left"/>
+      <w:pPr>
+        <w:tabs>
+          <w:tab w:val="num" w:pos="2880"/>
+        </w:tabs>
+        <w:ind w:left="2880" w:hanging="360"/>
+      </w:pPr>
+    </w:lvl>
+    <w:lvl w:ilvl="4" w:tentative="1">
+      <w:start w:val="1"/>
+      <w:numFmt w:val="decimal"/>
+      <w:lvlText w:val="%5."/>
+      <w:lvlJc w:val="left"/>
+      <w:pPr>
+        <w:tabs>
+          <w:tab w:val="num" w:pos="3600"/>
+        </w:tabs>
+        <w:ind w:left="3600" w:hanging="360"/>
+      </w:pPr>
+    </w:lvl>
+    <w:lvl w:ilvl="5" w:tentative="1">
+      <w:start w:val="1"/>
+      <w:numFmt w:val="decimal"/>
+      <w:lvlText w:val="%6."/>
+      <w:lvlJc w:val="left"/>
+      <w:pPr>
+        <w:tabs>
+          <w:tab w:val="num" w:pos="4320"/>
+        </w:tabs>
+        <w:ind w:left="4320" w:hanging="360"/>
+      </w:pPr>
+    </w:lvl>
+    <w:lvl w:ilvl="6" w:tentative="1">
+      <w:start w:val="1"/>
+      <w:numFmt w:val="decimal"/>
+      <w:lvlText w:val="%7."/>
+      <w:lvlJc w:val="left"/>
+      <w:pPr>
+        <w:tabs>
+          <w:tab w:val="num" w:pos="5040"/>
+        </w:tabs>
+        <w:ind w:left="5040" w:hanging="360"/>
+      </w:pPr>
+    </w:lvl>
+    <w:lvl w:ilvl="7" w:tentative="1">
+      <w:start w:val="1"/>
+      <w:numFmt w:val="decimal"/>
+      <w:lvlText w:val="%8."/>
+      <w:lvlJc w:val="left"/>
+      <w:pPr>
+        <w:tabs>
+          <w:tab w:val="num" w:pos="5760"/>
+        </w:tabs>
+        <w:ind w:left="5760" w:hanging="360"/>
+      </w:pPr>
+    </w:lvl>
+    <w:lvl w:ilvl="8" w:tentative="1">
+      <w:start w:val="1"/>
+      <w:numFmt w:val="decimal"/>
+      <w:lvlText w:val="%9."/>
+      <w:lvlJc w:val="left"/>
+      <w:pPr>
+        <w:tabs>
+          <w:tab w:val="num" w:pos="6480"/>
+        </w:tabs>
+        <w:ind w:left="6480" w:hanging="360"/>
+      </w:pPr>
+    </w:lvl>
+  </w:abstractNum>
+  <w:abstractNum w:abstractNumId="2" w15:restartNumberingAfterBreak="0">
     <w:nsid w:val="123B2132"/>
     <w:multiLevelType w:val="multilevel"/>
     <w:tmpl w:val="59FA5CC4"/>
@@ -1453,7 +1728,7 @@
       </w:rPr>
     </w:lvl>
   </w:abstractNum>
-  <w:abstractNum w:abstractNumId="2" w15:restartNumberingAfterBreak="0">
+  <w:abstractNum w:abstractNumId="3" w15:restartNumberingAfterBreak="0">
     <w:nsid w:val="18634378"/>
     <w:multiLevelType w:val="multilevel"/>
     <w:tmpl w:val="06567D5C"/>
@@ -1566,7 +1841,7 @@
       </w:pPr>
     </w:lvl>
   </w:abstractNum>
-  <w:abstractNum w:abstractNumId="3" w15:restartNumberingAfterBreak="0">
+  <w:abstractNum w:abstractNumId="4" w15:restartNumberingAfterBreak="0">
     <w:nsid w:val="2C2D6D8E"/>
     <w:multiLevelType w:val="multilevel"/>
     <w:tmpl w:val="63EA938E"/>
@@ -1715,17 +1990,440 @@
       </w:rPr>
     </w:lvl>
   </w:abstractNum>
+  <w:abstractNum w:abstractNumId="5" w15:restartNumberingAfterBreak="0">
+    <w:nsid w:val="456D351E"/>
+    <w:multiLevelType w:val="multilevel"/>
+    <w:tmpl w:val="D688A53E"/>
+    <w:lvl w:ilvl="0">
+      <w:start w:val="1"/>
+      <w:numFmt w:val="bullet"/>
+      <w:lvlText w:val=""/>
+      <w:lvlJc w:val="left"/>
+      <w:pPr>
+        <w:tabs>
+          <w:tab w:val="num" w:pos="720"/>
+        </w:tabs>
+        <w:ind w:left="720" w:hanging="360"/>
+      </w:pPr>
+      <w:rPr>
+        <w:rFonts w:ascii="Symbol" w:hAnsi="Symbol" w:hint="default"/>
+        <w:sz w:val="20"/>
+      </w:rPr>
+    </w:lvl>
+    <w:lvl w:ilvl="1" w:tentative="1">
+      <w:start w:val="1"/>
+      <w:numFmt w:val="bullet"/>
+      <w:lvlText w:val="o"/>
+      <w:lvlJc w:val="left"/>
+      <w:pPr>
+        <w:tabs>
+          <w:tab w:val="num" w:pos="1440"/>
+        </w:tabs>
+        <w:ind w:left="1440" w:hanging="360"/>
+      </w:pPr>
+      <w:rPr>
+        <w:rFonts w:ascii="Courier New" w:hAnsi="Courier New" w:hint="default"/>
+        <w:sz w:val="20"/>
+      </w:rPr>
+    </w:lvl>
+    <w:lvl w:ilvl="2" w:tentative="1">
+      <w:start w:val="1"/>
+      <w:numFmt w:val="bullet"/>
+      <w:lvlText w:val=""/>
+      <w:lvlJc w:val="left"/>
+      <w:pPr>
+        <w:tabs>
+          <w:tab w:val="num" w:pos="2160"/>
+        </w:tabs>
+        <w:ind w:left="2160" w:hanging="360"/>
+      </w:pPr>
+      <w:rPr>
+        <w:rFonts w:ascii="Wingdings" w:hAnsi="Wingdings" w:hint="default"/>
+        <w:sz w:val="20"/>
+      </w:rPr>
+    </w:lvl>
+    <w:lvl w:ilvl="3" w:tentative="1">
+      <w:start w:val="1"/>
+      <w:numFmt w:val="bullet"/>
+      <w:lvlText w:val=""/>
+      <w:lvlJc w:val="left"/>
+      <w:pPr>
+        <w:tabs>
+          <w:tab w:val="num" w:pos="2880"/>
+        </w:tabs>
+        <w:ind w:left="2880" w:hanging="360"/>
+      </w:pPr>
+      <w:rPr>
+        <w:rFonts w:ascii="Wingdings" w:hAnsi="Wingdings" w:hint="default"/>
+        <w:sz w:val="20"/>
+      </w:rPr>
+    </w:lvl>
+    <w:lvl w:ilvl="4" w:tentative="1">
+      <w:start w:val="1"/>
+      <w:numFmt w:val="bullet"/>
+      <w:lvlText w:val=""/>
+      <w:lvlJc w:val="left"/>
+      <w:pPr>
+        <w:tabs>
+          <w:tab w:val="num" w:pos="3600"/>
+        </w:tabs>
+        <w:ind w:left="3600" w:hanging="360"/>
+      </w:pPr>
+      <w:rPr>
+        <w:rFonts w:ascii="Wingdings" w:hAnsi="Wingdings" w:hint="default"/>
+        <w:sz w:val="20"/>
+      </w:rPr>
+    </w:lvl>
+    <w:lvl w:ilvl="5" w:tentative="1">
+      <w:start w:val="1"/>
+      <w:numFmt w:val="bullet"/>
+      <w:lvlText w:val=""/>
+      <w:lvlJc w:val="left"/>
+      <w:pPr>
+        <w:tabs>
+          <w:tab w:val="num" w:pos="4320"/>
+        </w:tabs>
+        <w:ind w:left="4320" w:hanging="360"/>
+      </w:pPr>
+      <w:rPr>
+        <w:rFonts w:ascii="Wingdings" w:hAnsi="Wingdings" w:hint="default"/>
+        <w:sz w:val="20"/>
+      </w:rPr>
+    </w:lvl>
+    <w:lvl w:ilvl="6" w:tentative="1">
+      <w:start w:val="1"/>
+      <w:numFmt w:val="bullet"/>
+      <w:lvlText w:val=""/>
+      <w:lvlJc w:val="left"/>
+      <w:pPr>
+        <w:tabs>
+          <w:tab w:val="num" w:pos="5040"/>
+        </w:tabs>
+        <w:ind w:left="5040" w:hanging="360"/>
+      </w:pPr>
+      <w:rPr>
+        <w:rFonts w:ascii="Wingdings" w:hAnsi="Wingdings" w:hint="default"/>
+        <w:sz w:val="20"/>
+      </w:rPr>
+    </w:lvl>
+    <w:lvl w:ilvl="7" w:tentative="1">
+      <w:start w:val="1"/>
+      <w:numFmt w:val="bullet"/>
+      <w:lvlText w:val=""/>
+      <w:lvlJc w:val="left"/>
+      <w:pPr>
+        <w:tabs>
+          <w:tab w:val="num" w:pos="5760"/>
+        </w:tabs>
+        <w:ind w:left="5760" w:hanging="360"/>
+      </w:pPr>
+      <w:rPr>
+        <w:rFonts w:ascii="Wingdings" w:hAnsi="Wingdings" w:hint="default"/>
+        <w:sz w:val="20"/>
+      </w:rPr>
+    </w:lvl>
+    <w:lvl w:ilvl="8" w:tentative="1">
+      <w:start w:val="1"/>
+      <w:numFmt w:val="bullet"/>
+      <w:lvlText w:val=""/>
+      <w:lvlJc w:val="left"/>
+      <w:pPr>
+        <w:tabs>
+          <w:tab w:val="num" w:pos="6480"/>
+        </w:tabs>
+        <w:ind w:left="6480" w:hanging="360"/>
+      </w:pPr>
+      <w:rPr>
+        <w:rFonts w:ascii="Wingdings" w:hAnsi="Wingdings" w:hint="default"/>
+        <w:sz w:val="20"/>
+      </w:rPr>
+    </w:lvl>
+  </w:abstractNum>
+  <w:abstractNum w:abstractNumId="6" w15:restartNumberingAfterBreak="0">
+    <w:nsid w:val="4E333C6A"/>
+    <w:multiLevelType w:val="multilevel"/>
+    <w:tmpl w:val="BC5CBBE0"/>
+    <w:lvl w:ilvl="0">
+      <w:start w:val="1"/>
+      <w:numFmt w:val="bullet"/>
+      <w:lvlText w:val=""/>
+      <w:lvlJc w:val="left"/>
+      <w:pPr>
+        <w:tabs>
+          <w:tab w:val="num" w:pos="720"/>
+        </w:tabs>
+        <w:ind w:left="720" w:hanging="360"/>
+      </w:pPr>
+      <w:rPr>
+        <w:rFonts w:ascii="Symbol" w:hAnsi="Symbol" w:hint="default"/>
+        <w:sz w:val="20"/>
+      </w:rPr>
+    </w:lvl>
+    <w:lvl w:ilvl="1" w:tentative="1">
+      <w:start w:val="1"/>
+      <w:numFmt w:val="bullet"/>
+      <w:lvlText w:val="o"/>
+      <w:lvlJc w:val="left"/>
+      <w:pPr>
+        <w:tabs>
+          <w:tab w:val="num" w:pos="1440"/>
+        </w:tabs>
+        <w:ind w:left="1440" w:hanging="360"/>
+      </w:pPr>
+      <w:rPr>
+        <w:rFonts w:ascii="Courier New" w:hAnsi="Courier New" w:hint="default"/>
+        <w:sz w:val="20"/>
+      </w:rPr>
+    </w:lvl>
+    <w:lvl w:ilvl="2" w:tentative="1">
+      <w:start w:val="1"/>
+      <w:numFmt w:val="bullet"/>
+      <w:lvlText w:val=""/>
+      <w:lvlJc w:val="left"/>
+      <w:pPr>
+        <w:tabs>
+          <w:tab w:val="num" w:pos="2160"/>
+        </w:tabs>
+        <w:ind w:left="2160" w:hanging="360"/>
+      </w:pPr>
+      <w:rPr>
+        <w:rFonts w:ascii="Wingdings" w:hAnsi="Wingdings" w:hint="default"/>
+        <w:sz w:val="20"/>
+      </w:rPr>
+    </w:lvl>
+    <w:lvl w:ilvl="3" w:tentative="1">
+      <w:start w:val="1"/>
+      <w:numFmt w:val="bullet"/>
+      <w:lvlText w:val=""/>
+      <w:lvlJc w:val="left"/>
+      <w:pPr>
+        <w:tabs>
+          <w:tab w:val="num" w:pos="2880"/>
+        </w:tabs>
+        <w:ind w:left="2880" w:hanging="360"/>
+      </w:pPr>
+      <w:rPr>
+        <w:rFonts w:ascii="Wingdings" w:hAnsi="Wingdings" w:hint="default"/>
+        <w:sz w:val="20"/>
+      </w:rPr>
+    </w:lvl>
+    <w:lvl w:ilvl="4" w:tentative="1">
+      <w:start w:val="1"/>
+      <w:numFmt w:val="bullet"/>
+      <w:lvlText w:val=""/>
+      <w:lvlJc w:val="left"/>
+      <w:pPr>
+        <w:tabs>
+          <w:tab w:val="num" w:pos="3600"/>
+        </w:tabs>
+        <w:ind w:left="3600" w:hanging="360"/>
+      </w:pPr>
+      <w:rPr>
+        <w:rFonts w:ascii="Wingdings" w:hAnsi="Wingdings" w:hint="default"/>
+        <w:sz w:val="20"/>
+      </w:rPr>
+    </w:lvl>
+    <w:lvl w:ilvl="5" w:tentative="1">
+      <w:start w:val="1"/>
+      <w:numFmt w:val="bullet"/>
+      <w:lvlText w:val=""/>
+      <w:lvlJc w:val="left"/>
+      <w:pPr>
+        <w:tabs>
+          <w:tab w:val="num" w:pos="4320"/>
+        </w:tabs>
+        <w:ind w:left="4320" w:hanging="360"/>
+      </w:pPr>
+      <w:rPr>
+        <w:rFonts w:ascii="Wingdings" w:hAnsi="Wingdings" w:hint="default"/>
+        <w:sz w:val="20"/>
+      </w:rPr>
+    </w:lvl>
+    <w:lvl w:ilvl="6" w:tentative="1">
+      <w:start w:val="1"/>
+      <w:numFmt w:val="bullet"/>
+      <w:lvlText w:val=""/>
+      <w:lvlJc w:val="left"/>
+      <w:pPr>
+        <w:tabs>
+          <w:tab w:val="num" w:pos="5040"/>
+        </w:tabs>
+        <w:ind w:left="5040" w:hanging="360"/>
+      </w:pPr>
+      <w:rPr>
+        <w:rFonts w:ascii="Wingdings" w:hAnsi="Wingdings" w:hint="default"/>
+        <w:sz w:val="20"/>
+      </w:rPr>
+    </w:lvl>
+    <w:lvl w:ilvl="7" w:tentative="1">
+      <w:start w:val="1"/>
+      <w:numFmt w:val="bullet"/>
+      <w:lvlText w:val=""/>
+      <w:lvlJc w:val="left"/>
+      <w:pPr>
+        <w:tabs>
+          <w:tab w:val="num" w:pos="5760"/>
+        </w:tabs>
+        <w:ind w:left="5760" w:hanging="360"/>
+      </w:pPr>
+      <w:rPr>
+        <w:rFonts w:ascii="Wingdings" w:hAnsi="Wingdings" w:hint="default"/>
+        <w:sz w:val="20"/>
+      </w:rPr>
+    </w:lvl>
+    <w:lvl w:ilvl="8" w:tentative="1">
+      <w:start w:val="1"/>
+      <w:numFmt w:val="bullet"/>
+      <w:lvlText w:val=""/>
+      <w:lvlJc w:val="left"/>
+      <w:pPr>
+        <w:tabs>
+          <w:tab w:val="num" w:pos="6480"/>
+        </w:tabs>
+        <w:ind w:left="6480" w:hanging="360"/>
+      </w:pPr>
+      <w:rPr>
+        <w:rFonts w:ascii="Wingdings" w:hAnsi="Wingdings" w:hint="default"/>
+        <w:sz w:val="20"/>
+      </w:rPr>
+    </w:lvl>
+  </w:abstractNum>
+  <w:abstractNum w:abstractNumId="7" w15:restartNumberingAfterBreak="0">
+    <w:nsid w:val="5B1F0E84"/>
+    <w:multiLevelType w:val="multilevel"/>
+    <w:tmpl w:val="38DA92AA"/>
+    <w:lvl w:ilvl="0">
+      <w:start w:val="1"/>
+      <w:numFmt w:val="decimal"/>
+      <w:lvlText w:val="%1."/>
+      <w:lvlJc w:val="left"/>
+      <w:pPr>
+        <w:tabs>
+          <w:tab w:val="num" w:pos="720"/>
+        </w:tabs>
+        <w:ind w:left="720" w:hanging="360"/>
+      </w:pPr>
+    </w:lvl>
+    <w:lvl w:ilvl="1" w:tentative="1">
+      <w:start w:val="1"/>
+      <w:numFmt w:val="decimal"/>
+      <w:lvlText w:val="%2."/>
+      <w:lvlJc w:val="left"/>
+      <w:pPr>
+        <w:tabs>
+          <w:tab w:val="num" w:pos="1440"/>
+        </w:tabs>
+        <w:ind w:left="1440" w:hanging="360"/>
+      </w:pPr>
+    </w:lvl>
+    <w:lvl w:ilvl="2" w:tentative="1">
+      <w:start w:val="1"/>
+      <w:numFmt w:val="decimal"/>
+      <w:lvlText w:val="%3."/>
+      <w:lvlJc w:val="left"/>
+      <w:pPr>
+        <w:tabs>
+          <w:tab w:val="num" w:pos="2160"/>
+        </w:tabs>
+        <w:ind w:left="2160" w:hanging="360"/>
+      </w:pPr>
+    </w:lvl>
+    <w:lvl w:ilvl="3" w:tentative="1">
+      <w:start w:val="1"/>
+      <w:numFmt w:val="decimal"/>
+      <w:lvlText w:val="%4."/>
+      <w:lvlJc w:val="left"/>
+      <w:pPr>
+        <w:tabs>
+          <w:tab w:val="num" w:pos="2880"/>
+        </w:tabs>
+        <w:ind w:left="2880" w:hanging="360"/>
+      </w:pPr>
+    </w:lvl>
+    <w:lvl w:ilvl="4" w:tentative="1">
+      <w:start w:val="1"/>
+      <w:numFmt w:val="decimal"/>
+      <w:lvlText w:val="%5."/>
+      <w:lvlJc w:val="left"/>
+      <w:pPr>
+        <w:tabs>
+          <w:tab w:val="num" w:pos="3600"/>
+        </w:tabs>
+        <w:ind w:left="3600" w:hanging="360"/>
+      </w:pPr>
+    </w:lvl>
+    <w:lvl w:ilvl="5" w:tentative="1">
+      <w:start w:val="1"/>
+      <w:numFmt w:val="decimal"/>
+      <w:lvlText w:val="%6."/>
+      <w:lvlJc w:val="left"/>
+      <w:pPr>
+        <w:tabs>
+          <w:tab w:val="num" w:pos="4320"/>
+        </w:tabs>
+        <w:ind w:left="4320" w:hanging="360"/>
+      </w:pPr>
+    </w:lvl>
+    <w:lvl w:ilvl="6" w:tentative="1">
+      <w:start w:val="1"/>
+      <w:numFmt w:val="decimal"/>
+      <w:lvlText w:val="%7."/>
+      <w:lvlJc w:val="left"/>
+      <w:pPr>
+        <w:tabs>
+          <w:tab w:val="num" w:pos="5040"/>
+        </w:tabs>
+        <w:ind w:left="5040" w:hanging="360"/>
+      </w:pPr>
+    </w:lvl>
+    <w:lvl w:ilvl="7" w:tentative="1">
+      <w:start w:val="1"/>
+      <w:numFmt w:val="decimal"/>
+      <w:lvlText w:val="%8."/>
+      <w:lvlJc w:val="left"/>
+      <w:pPr>
+        <w:tabs>
+          <w:tab w:val="num" w:pos="5760"/>
+        </w:tabs>
+        <w:ind w:left="5760" w:hanging="360"/>
+      </w:pPr>
+    </w:lvl>
+    <w:lvl w:ilvl="8" w:tentative="1">
+      <w:start w:val="1"/>
+      <w:numFmt w:val="decimal"/>
+      <w:lvlText w:val="%9."/>
+      <w:lvlJc w:val="left"/>
+      <w:pPr>
+        <w:tabs>
+          <w:tab w:val="num" w:pos="6480"/>
+        </w:tabs>
+        <w:ind w:left="6480" w:hanging="360"/>
+      </w:pPr>
+    </w:lvl>
+  </w:abstractNum>
   <w:num w:numId="1" w16cid:durableId="495146823">
-    <w:abstractNumId w:val="3"/>
+    <w:abstractNumId w:val="4"/>
   </w:num>
   <w:num w:numId="2" w16cid:durableId="745539286">
-    <w:abstractNumId w:val="1"/>
+    <w:abstractNumId w:val="2"/>
   </w:num>
   <w:num w:numId="3" w16cid:durableId="250939495">
     <w:abstractNumId w:val="0"/>
   </w:num>
   <w:num w:numId="4" w16cid:durableId="1705979932">
-    <w:abstractNumId w:val="2"/>
+    <w:abstractNumId w:val="3"/>
+  </w:num>
+  <w:num w:numId="5" w16cid:durableId="1978605515">
+    <w:abstractNumId w:val="7"/>
+  </w:num>
+  <w:num w:numId="6" w16cid:durableId="223831331">
+    <w:abstractNumId w:val="6"/>
+  </w:num>
+  <w:num w:numId="7" w16cid:durableId="1813328712">
+    <w:abstractNumId w:val="5"/>
+  </w:num>
+  <w:num w:numId="8" w16cid:durableId="2110855743">
+    <w:abstractNumId w:val="1"/>
   </w:num>
 </w:numbering>
 </file>

</xml_diff>